<commit_message>
fixed bugs, recommended statistical methods functionlity, p-value variable name correction, updated .bat files
</commit_message>
<xml_diff>
--- a/docs/Info Statistical Analysis.docx
+++ b/docs/Info Statistical Analysis.docx
@@ -150,7 +150,7 @@
         <w:t>Several timepoints:</w:t>
       </w:r>
       <w:r>
-        <w:t xml:space="preserve"> two-way repeated-measures ANOVA (mixed design), mixed-effects model (REML) or generalized estimating equations (GEE). You can also run any single-timepoint test separately at each timepoint.</w:t>
+        <w:t xml:space="preserve"> two-way repeated-measures ANOVA (mixed design), mixed-effects model (REML) or generalized estimating equations (GEE). You can also run any single-timepoint test separately at each timepoint. These models need at least 3 animals per group; with fewer, "Auto" tests each timepoint separately instead. With fewer than 40 animals, GEE automatically uses a small-sample (Mancl-DeRouen) correction of its standard errors, so its p-values are not too small.</w:t>
       </w:r>
     </w:p>
     <w:p>
@@ -183,6 +183,7 @@
         <w:rPr>
           <w:b/>
         </w:rPr>
+        <w:lastRenderedPageBreak/>
         <w:t>Tukey's HSD:</w:t>
       </w:r>
       <w:r>
@@ -276,7 +277,7 @@
         <w:pStyle w:val="ListBullet"/>
       </w:pPr>
       <w:r>
-        <w:t>GEE with fewer than 40 subjects. GEE p-values can be too small in small samples.</w:t>
+        <w:t>A repeated-measures test with fewer than 3 animals in a group. This is shown as a red error because the model cannot be fitted; "Auto" avoids it by testing each timepoint separately.</w:t>
       </w:r>
     </w:p>
     <w:p>
@@ -428,6 +429,7 @@
         <w:rPr>
           <w:b/>
         </w:rPr>
+        <w:lastRenderedPageBreak/>
         <w:t>p:</w:t>
       </w:r>
       <w:r>
@@ -658,6 +660,7 @@
         <w:rPr>
           <w:b/>
         </w:rPr>
+        <w:lastRenderedPageBreak/>
         <w:t>Benjamini-Hochberg and two-stage Benjamini-Krieger-Yekutieli (FDR):</w:t>
       </w:r>
       <w:r>

</xml_diff>